<commit_message>
Fill in the report cover details and rebuild the PDF
Sets the student name and the video recording link, which were placeholders,
and regenerates the PDF and DOCX from the builder.

The DOCX had also gone stale: LibreOffice silently declined the conversion
when its profile was locked, so the previous file still carried the old
cover page. Rebuilding with an isolated profile fixes it, and the check for
that is now part of the build output.
</commit_message>
<xml_diff>
--- a/report/report.docx
+++ b/report/report.docx
@@ -42,7 +42,7 @@
           <w:bdr w:val="single" w:sz="24" w:space="9" w:color="12305C"/>
           <w:shd w:fill="F2F5FA" w:val="clear"/>
         </w:rPr>
-        <w:t xml:space="preserve"> Nziza Pacifique</w:t>
+        <w:t xml:space="preserve"> Nziza Aime Pacifique</w:t>
       </w:r>
     </w:p>
     <w:p>
@@ -71,7 +71,7 @@
           <w:bdr w:val="single" w:sz="24" w:space="9" w:color="12305C"/>
           <w:shd w:fill="F2F5FA" w:val="clear"/>
         </w:rPr>
-        <w:t xml:space="preserve"> [paste your video link here]</w:t>
+        <w:t xml:space="preserve"> https://drive.google.com/file/d/1ZsFxY9nqWZWnrMkExikMvVPvDAjsUNLA/view?usp=sharing</w:t>
       </w:r>
     </w:p>
     <w:p>

</xml_diff>